<commit_message>
Update discrete-data lecture and aligned exercise materials
</commit_message>
<xml_diff>
--- a/Exercise-03-Solution.docx
+++ b/Exercise-03-Solution.docx
@@ -10,7 +10,7 @@
         <w:t xml:space="preserve">Exercise 3 Solution</w:t>
       </w:r>
     </w:p>
-    <w:bookmarkStart w:id="23" w:name="exercise-3"/>
+    <w:bookmarkStart w:id="9" w:name="exercise-3"/>
     <w:p>
       <w:pPr>
         <w:pStyle w:val="Heading2"/>
@@ -24,7 +24,53 @@
         <w:pStyle w:val="FirstParagraph"/>
       </w:pPr>
       <w:r>
-        <w:t xml:space="preserve">In RStudio, create a new Quarto document and do the following.</w:t>
+        <w:t xml:space="preserve">Patagonia wants to understand how customer profiles differ across U.S. regions before planning regional marketing messages.</w:t>
+      </w:r>
+    </w:p>
+    <w:p>
+      <w:pPr>
+        <w:pStyle w:val="BodyText"/>
+      </w:pPr>
+      <w:r>
+        <w:t xml:space="preserve">Using</w:t>
+      </w:r>
+      <w:r>
+        <w:t xml:space="preserve"> </w:t>
+      </w:r>
+      <w:r>
+        <w:rPr>
+          <w:rStyle w:val="VerbatimChar"/>
+        </w:rPr>
+        <w:t xml:space="preserve">customer_data.csv</w:t>
+      </w:r>
+      <w:r>
+        <w:t xml:space="preserve">, choose one discrete customer characteristic. Prepare a count table and a clearly labeled chart comparing that characteristic across regions. Explain one finding that could inform regional messaging and one limitation of that conclusion. Choose the chart form and analysis approach yourself.</w:t>
+      </w:r>
+    </w:p>
+    <w:p>
+      <w:pPr>
+        <w:pStyle w:val="BodyText"/>
+      </w:pPr>
+      <w:r>
+        <w:t xml:space="preserve">Submit a Word document rendered from Quarto containing your code, table, chart, and interpretation. Use the tidyverse and the coding conventions practiced in class.</w:t>
+      </w:r>
+    </w:p>
+    <w:bookmarkEnd w:id="9"/>
+    <w:bookmarkStart w:id="10" w:name="grading-rubric"/>
+    <w:p>
+      <w:pPr>
+        <w:pStyle w:val="Heading2"/>
+      </w:pPr>
+      <w:r>
+        <w:t xml:space="preserve">Grading Rubric</w:t>
+      </w:r>
+    </w:p>
+    <w:p>
+      <w:pPr>
+        <w:pStyle w:val="FirstParagraph"/>
+      </w:pPr>
+      <w:r>
+        <w:t xml:space="preserve">Five points total, one point each for:</w:t>
       </w:r>
     </w:p>
     <w:p>
@@ -36,7 +82,140 @@
         </w:numPr>
       </w:pPr>
       <w:r>
-        <w:t xml:space="preserve">Load the tidyverse.</w:t>
+        <w:rPr>
+          <w:b/>
+          <w:bCs/>
+        </w:rPr>
+        <w:t xml:space="preserve">Choosing an appropriate discrete variable.</w:t>
+      </w:r>
+      <w:r>
+        <w:t xml:space="preserve"> </w:t>
+      </w:r>
+      <w:r>
+        <w:t xml:space="preserve">Options for the characteristic being compared are</w:t>
+      </w:r>
+      <w:r>
+        <w:t xml:space="preserve"> </w:t>
+      </w:r>
+      <w:r>
+        <w:rPr>
+          <w:rStyle w:val="VerbatimChar"/>
+        </w:rPr>
+        <w:t xml:space="preserve">gender</w:t>
+      </w:r>
+      <w:r>
+        <w:t xml:space="preserve">,</w:t>
+      </w:r>
+      <w:r>
+        <w:t xml:space="preserve"> </w:t>
+      </w:r>
+      <w:r>
+        <w:rPr>
+          <w:rStyle w:val="VerbatimChar"/>
+        </w:rPr>
+        <w:t xml:space="preserve">married</w:t>
+      </w:r>
+      <w:r>
+        <w:t xml:space="preserve">,</w:t>
+      </w:r>
+      <w:r>
+        <w:t xml:space="preserve"> </w:t>
+      </w:r>
+      <w:r>
+        <w:rPr>
+          <w:rStyle w:val="VerbatimChar"/>
+        </w:rPr>
+        <w:t xml:space="preserve">college_degree</w:t>
+      </w:r>
+      <w:r>
+        <w:t xml:space="preserve">,</w:t>
+      </w:r>
+      <w:r>
+        <w:t xml:space="preserve"> </w:t>
+      </w:r>
+      <w:r>
+        <w:rPr>
+          <w:rStyle w:val="VerbatimChar"/>
+        </w:rPr>
+        <w:t xml:space="preserve">state</w:t>
+      </w:r>
+      <w:r>
+        <w:t xml:space="preserve">, or</w:t>
+      </w:r>
+      <w:r>
+        <w:t xml:space="preserve"> </w:t>
+      </w:r>
+      <w:r>
+        <w:rPr>
+          <w:rStyle w:val="VerbatimChar"/>
+        </w:rPr>
+        <w:t xml:space="preserve">star_rating</w:t>
+      </w:r>
+      <w:r>
+        <w:t xml:space="preserve"> </w:t>
+      </w:r>
+      <w:r>
+        <w:t xml:space="preserve">treated as ordered categories.</w:t>
+      </w:r>
+      <w:r>
+        <w:t xml:space="preserve"> </w:t>
+      </w:r>
+      <w:r>
+        <w:rPr>
+          <w:rStyle w:val="VerbatimChar"/>
+        </w:rPr>
+        <w:t xml:space="preserve">birth_year</w:t>
+      </w:r>
+      <w:r>
+        <w:t xml:space="preserve"> </w:t>
+      </w:r>
+      <w:r>
+        <w:t xml:space="preserve">also qualifies when analyzed as distinct year categories with a meaningful interpretation.</w:t>
+      </w:r>
+      <w:r>
+        <w:t xml:space="preserve"> </w:t>
+      </w:r>
+      <w:r>
+        <w:rPr>
+          <w:rStyle w:val="VerbatimChar"/>
+        </w:rPr>
+        <w:t xml:space="preserve">region</w:t>
+      </w:r>
+      <w:r>
+        <w:t xml:space="preserve"> </w:t>
+      </w:r>
+      <w:r>
+        <w:t xml:space="preserve">supplies the comparison groups; it is not an additional characteristic to compare with itself. IDs identify individual records, and raw review text is unstructured; neither alone provides the requested customer-profile comparison. Continuous measurements such as</w:t>
+      </w:r>
+      <w:r>
+        <w:t xml:space="preserve"> </w:t>
+      </w:r>
+      <w:r>
+        <w:rPr>
+          <w:rStyle w:val="VerbatimChar"/>
+        </w:rPr>
+        <w:t xml:space="preserve">income</w:t>
+      </w:r>
+      <w:r>
+        <w:t xml:space="preserve"> </w:t>
+      </w:r>
+      <w:r>
+        <w:t xml:space="preserve">and</w:t>
+      </w:r>
+      <w:r>
+        <w:t xml:space="preserve"> </w:t>
+      </w:r>
+      <w:r>
+        <w:rPr>
+          <w:rStyle w:val="VerbatimChar"/>
+        </w:rPr>
+        <w:t xml:space="preserve">credit</w:t>
+      </w:r>
+      <w:r>
+        <w:t xml:space="preserve"> </w:t>
+      </w:r>
+      <w:r>
+        <w:t xml:space="preserve">do not meet this criterion merely because they are stored as numbers.</w:t>
       </w:r>
     </w:p>
     <w:p>
@@ -48,22 +227,17 @@
         </w:numPr>
       </w:pPr>
       <w:r>
-        <w:t xml:space="preserve">Import and explore</w:t>
-      </w:r>
-      <w:r>
-        <w:t xml:space="preserve"> </w:t>
-      </w:r>
-      <w:r>
-        <w:rPr>
-          <w:rStyle w:val="VerbatimChar"/>
-        </w:rPr>
-        <w:t xml:space="preserve">customer_data</w:t>
-      </w:r>
-      <w:r>
-        <w:t xml:space="preserve"> </w:t>
-      </w:r>
-      <w:r>
-        <w:t xml:space="preserve">using the functions we’ve covered.</w:t>
+        <w:rPr>
+          <w:b/>
+          <w:bCs/>
+        </w:rPr>
+        <w:t xml:space="preserve">Providing a correct count table</w:t>
+      </w:r>
+      <w:r>
+        <w:t xml:space="preserve"> </w:t>
+      </w:r>
+      <w:r>
+        <w:t xml:space="preserve">comparing the chosen characteristic across regions.</w:t>
       </w:r>
     </w:p>
     <w:p>
@@ -75,7 +249,17 @@
         </w:numPr>
       </w:pPr>
       <w:r>
-        <w:t xml:space="preserve">Provide at least one interesting numeric summary and one interesting visualization using discrete variables only.</w:t>
+        <w:rPr>
+          <w:b/>
+          <w:bCs/>
+        </w:rPr>
+        <w:t xml:space="preserve">Providing a correct, clearly labeled visualization</w:t>
+      </w:r>
+      <w:r>
+        <w:t xml:space="preserve"> </w:t>
+      </w:r>
+      <w:r>
+        <w:t xml:space="preserve">comparing that characteristic across regions. Counts or within-region proportions are acceptable when labeled accurately.</w:t>
       </w:r>
     </w:p>
     <w:p>
@@ -87,19 +271,17 @@
         </w:numPr>
       </w:pPr>
       <w:r>
-        <w:t xml:space="preserve">Practice good coding conventions: Comment often, write in consecutive lines of code using the</w:t>
-      </w:r>
-      <w:r>
-        <w:t xml:space="preserve"> </w:t>
-      </w:r>
-      <w:r>
-        <w:rPr>
-          <w:rStyle w:val="VerbatimChar"/>
-        </w:rPr>
-        <w:t xml:space="preserve">|&gt;</w:t>
-      </w:r>
-      <w:r>
-        <w:t xml:space="preserve">, and use the demonstrated style (e.g., variable names, spacing within functions).</w:t>
+        <w:rPr>
+          <w:b/>
+          <w:bCs/>
+        </w:rPr>
+        <w:t xml:space="preserve">Following good coding conventions,</w:t>
+      </w:r>
+      <w:r>
+        <w:t xml:space="preserve"> </w:t>
+      </w:r>
+      <w:r>
+        <w:t xml:space="preserve">including use of the tidyverse, readable pipes and spacing, meaningful names, and useful comments.</w:t>
       </w:r>
     </w:p>
     <w:p>
@@ -111,7 +293,17 @@
         </w:numPr>
       </w:pPr>
       <w:r>
-        <w:t xml:space="preserve">Render the Word doc and upload to Canvas.</w:t>
+        <w:rPr>
+          <w:b/>
+          <w:bCs/>
+        </w:rPr>
+        <w:t xml:space="preserve">Submitting a rendered Word document</w:t>
+      </w:r>
+      <w:r>
+        <w:t xml:space="preserve"> </w:t>
+      </w:r>
+      <w:r>
+        <w:t xml:space="preserve">containing code, the table, chart, and written interpretation.</w:t>
       </w:r>
     </w:p>
     <w:p>
@@ -119,47 +311,25 @@
         <w:pStyle w:val="FirstParagraph"/>
       </w:pPr>
       <w:r>
-        <w:t xml:space="preserve">Five points total, one point each for:</w:t>
-      </w:r>
-    </w:p>
-    <w:p>
-      <w:pPr>
-        <w:pStyle w:val="BodyText"/>
-      </w:pPr>
-      <w:r>
-        <w:t xml:space="preserve">- Loading the tidyverse.</w:t>
-      </w:r>
-    </w:p>
-    <w:p>
-      <w:pPr>
-        <w:pStyle w:val="BodyText"/>
-      </w:pPr>
-      <w:r>
-        <w:t xml:space="preserve">- Providing at least one numeric summary.</w:t>
-      </w:r>
-    </w:p>
-    <w:p>
-      <w:pPr>
-        <w:pStyle w:val="BodyText"/>
-      </w:pPr>
-      <w:r>
-        <w:t xml:space="preserve">- Providing at least one visualization.</w:t>
-      </w:r>
-    </w:p>
-    <w:p>
-      <w:pPr>
-        <w:pStyle w:val="BodyText"/>
-      </w:pPr>
-      <w:r>
-        <w:t xml:space="preserve">- Following good coding conventions (e.g., using pipe operators, including comments).</w:t>
-      </w:r>
-    </w:p>
-    <w:p>
-      <w:pPr>
-        <w:pStyle w:val="BodyText"/>
-      </w:pPr>
-      <w:r>
-        <w:t xml:space="preserve">- Submitting a rendered Word doc.</w:t>
+        <w:t xml:space="preserve">Different variables, chart forms, and defensible interpretations can earn full credit. The example below is one possible response, not an output students must duplicate.</w:t>
+      </w:r>
+    </w:p>
+    <w:bookmarkEnd w:id="10"/>
+    <w:bookmarkStart w:id="17" w:name="one-possible-solution"/>
+    <w:p>
+      <w:pPr>
+        <w:pStyle w:val="Heading2"/>
+      </w:pPr>
+      <w:r>
+        <w:t xml:space="preserve">One Possible Solution</w:t>
+      </w:r>
+    </w:p>
+    <w:p>
+      <w:pPr>
+        <w:pStyle w:val="FirstParagraph"/>
+      </w:pPr>
+      <w:r>
+        <w:t xml:space="preserve">We compare college-degree status across regions to describe one aspect of the customer base that could inform regional messaging research.</w:t>
       </w:r>
     </w:p>
     <w:p>
@@ -170,10 +340,7 @@
         <w:rPr>
           <w:rStyle w:val="CommentTok"/>
         </w:rPr>
-        <w:t xml:space="preserve"># Load the tidyverse.</w:t>
-      </w:r>
-      <w:r>
-        <w:br/>
+        <w:t xml:space="preserve"># Load the tools and import the customer records.</w:t>
       </w:r>
       <w:r>
         <w:br/>
@@ -190,6 +357,87 @@
         </w:rPr>
         <w:t xml:space="preserve">(tidyverse)</w:t>
       </w:r>
+      <w:r>
+        <w:br/>
+      </w:r>
+      <w:r>
+        <w:br/>
+      </w:r>
+      <w:r>
+        <w:rPr>
+          <w:rStyle w:val="NormalTok"/>
+        </w:rPr>
+        <w:t xml:space="preserve">customer_data </w:t>
+      </w:r>
+      <w:r>
+        <w:rPr>
+          <w:rStyle w:val="OtherTok"/>
+        </w:rPr>
+        <w:t xml:space="preserve">&lt;-</w:t>
+      </w:r>
+      <w:r>
+        <w:rPr>
+          <w:rStyle w:val="NormalTok"/>
+        </w:rPr>
+        <w:t xml:space="preserve"> </w:t>
+      </w:r>
+      <w:r>
+        <w:rPr>
+          <w:rStyle w:val="FunctionTok"/>
+        </w:rPr>
+        <w:t xml:space="preserve">read_csv</w:t>
+      </w:r>
+      <w:r>
+        <w:rPr>
+          <w:rStyle w:val="NormalTok"/>
+        </w:rPr>
+        <w:t xml:space="preserve">(</w:t>
+      </w:r>
+      <w:r>
+        <w:rPr>
+          <w:rStyle w:val="StringTok"/>
+        </w:rPr>
+        <w:t xml:space="preserve">"customer_data.csv"</w:t>
+      </w:r>
+      <w:r>
+        <w:rPr>
+          <w:rStyle w:val="NormalTok"/>
+        </w:rPr>
+        <w:t xml:space="preserve">, </w:t>
+      </w:r>
+      <w:r>
+        <w:rPr>
+          <w:rStyle w:val="AttributeTok"/>
+        </w:rPr>
+        <w:t xml:space="preserve">show_col_types =</w:t>
+      </w:r>
+      <w:r>
+        <w:rPr>
+          <w:rStyle w:val="NormalTok"/>
+        </w:rPr>
+        <w:t xml:space="preserve"> </w:t>
+      </w:r>
+      <w:r>
+        <w:rPr>
+          <w:rStyle w:val="ConstantTok"/>
+        </w:rPr>
+        <w:t xml:space="preserve">FALSE</w:t>
+      </w:r>
+      <w:r>
+        <w:rPr>
+          <w:rStyle w:val="NormalTok"/>
+        </w:rPr>
+        <w:t xml:space="preserve">)</w:t>
+      </w:r>
+    </w:p>
+    <w:bookmarkStart w:id="11" w:name="customer-counts"/>
+    <w:p>
+      <w:pPr>
+        <w:pStyle w:val="Heading3"/>
+      </w:pPr>
+      <w:r>
+        <w:t xml:space="preserve">Customer Counts</w:t>
+      </w:r>
     </w:p>
     <w:p>
       <w:pPr>
@@ -197,9 +445,56 @@
       </w:pPr>
       <w:r>
         <w:rPr>
+          <w:rStyle w:val="CommentTok"/>
+        </w:rPr>
+        <w:t xml:space="preserve"># Count customers in each region and degree-status category.</w:t>
+      </w:r>
+      <w:r>
+        <w:br/>
+      </w:r>
+      <w:r>
+        <w:rPr>
+          <w:rStyle w:val="NormalTok"/>
+        </w:rPr>
+        <w:t xml:space="preserve">customer_data </w:t>
+      </w:r>
+      <w:r>
+        <w:rPr>
+          <w:rStyle w:val="SpecialCharTok"/>
+        </w:rPr>
+        <w:t xml:space="preserve">|&gt;</w:t>
+      </w:r>
+      <w:r>
+        <w:br/>
+      </w:r>
+      <w:r>
+        <w:rPr>
+          <w:rStyle w:val="NormalTok"/>
+        </w:rPr>
+        <w:t xml:space="preserve">  </w:t>
+      </w:r>
+      <w:r>
+        <w:rPr>
+          <w:rStyle w:val="FunctionTok"/>
+        </w:rPr>
+        <w:t xml:space="preserve">count</w:t>
+      </w:r>
+      <w:r>
+        <w:rPr>
+          <w:rStyle w:val="NormalTok"/>
+        </w:rPr>
+        <w:t xml:space="preserve">(region, college_degree)</w:t>
+      </w:r>
+    </w:p>
+    <w:p>
+      <w:pPr>
+        <w:pStyle w:val="SourceCode"/>
+      </w:pPr>
+      <w:r>
+        <w:rPr>
           <w:rStyle w:val="VerbatimChar"/>
         </w:rPr>
-        <w:t xml:space="preserve">── Attaching core tidyverse packages ──────────────────────── tidyverse 2.0.0 ──</w:t>
+        <w:t xml:space="preserve"># A tibble: 8 x 3</w:t>
       </w:r>
       <w:r>
         <w:br/>
@@ -208,7 +503,7 @@
         <w:rPr>
           <w:rStyle w:val="VerbatimChar"/>
         </w:rPr>
-        <w:t xml:space="preserve">✔ dplyr     1.1.4     ✔ readr     2.1.5</w:t>
+        <w:t xml:space="preserve">  region    college_degree     n</w:t>
       </w:r>
       <w:r>
         <w:br/>
@@ -217,7 +512,7 @@
         <w:rPr>
           <w:rStyle w:val="VerbatimChar"/>
         </w:rPr>
-        <w:t xml:space="preserve">✔ forcats   1.0.0     ✔ stringr   1.5.1</w:t>
+        <w:t xml:space="preserve">  &lt;chr&gt;     &lt;chr&gt;          &lt;int&gt;</w:t>
       </w:r>
       <w:r>
         <w:br/>
@@ -226,7 +521,7 @@
         <w:rPr>
           <w:rStyle w:val="VerbatimChar"/>
         </w:rPr>
-        <w:t xml:space="preserve">✔ ggplot2   3.5.2     ✔ tibble    3.3.0</w:t>
+        <w:t xml:space="preserve">1 Midwest   No               229</w:t>
       </w:r>
       <w:r>
         <w:br/>
@@ -235,7 +530,7 @@
         <w:rPr>
           <w:rStyle w:val="VerbatimChar"/>
         </w:rPr>
-        <w:t xml:space="preserve">✔ lubridate 1.9.4     ✔ tidyr     1.3.1</w:t>
+        <w:t xml:space="preserve">2 Midwest   Yes              872</w:t>
       </w:r>
       <w:r>
         <w:br/>
@@ -244,7 +539,7 @@
         <w:rPr>
           <w:rStyle w:val="VerbatimChar"/>
         </w:rPr>
-        <w:t xml:space="preserve">✔ purrr     1.1.0     </w:t>
+        <w:t xml:space="preserve">3 Northeast No               640</w:t>
       </w:r>
       <w:r>
         <w:br/>
@@ -253,7 +548,7 @@
         <w:rPr>
           <w:rStyle w:val="VerbatimChar"/>
         </w:rPr>
-        <w:t xml:space="preserve">── Conflicts ────────────────────────────────────────── tidyverse_conflicts() ──</w:t>
+        <w:t xml:space="preserve">4 Northeast Yes             2584</w:t>
       </w:r>
       <w:r>
         <w:br/>
@@ -262,7 +557,7 @@
         <w:rPr>
           <w:rStyle w:val="VerbatimChar"/>
         </w:rPr>
-        <w:t xml:space="preserve">✖ dplyr::filter() masks stats::filter()</w:t>
+        <w:t xml:space="preserve">5 South     No               891</w:t>
       </w:r>
       <w:r>
         <w:br/>
@@ -271,7 +566,7 @@
         <w:rPr>
           <w:rStyle w:val="VerbatimChar"/>
         </w:rPr>
-        <w:t xml:space="preserve">✖ dplyr::lag()    masks stats::lag()</w:t>
+        <w:t xml:space="preserve">6 South     Yes              220</w:t>
       </w:r>
       <w:r>
         <w:br/>
@@ -280,7 +575,34 @@
         <w:rPr>
           <w:rStyle w:val="VerbatimChar"/>
         </w:rPr>
-        <w:t xml:space="preserve">ℹ Use the conflicted package (&lt;http://conflicted.r-lib.org/&gt;) to force all conflicts to become errors</w:t>
+        <w:t xml:space="preserve">7 West      No               989</w:t>
+      </w:r>
+      <w:r>
+        <w:br/>
+      </w:r>
+      <w:r>
+        <w:rPr>
+          <w:rStyle w:val="VerbatimChar"/>
+        </w:rPr>
+        <w:t xml:space="preserve">8 West      Yes             4106</w:t>
+      </w:r>
+    </w:p>
+    <w:p>
+      <w:pPr>
+        <w:pStyle w:val="FirstParagraph"/>
+      </w:pPr>
+      <w:r>
+        <w:t xml:space="preserve">The table shows customer counts. Because regions have different numbers of customers, the chart below compares the mix within each region using proportions.</w:t>
+      </w:r>
+    </w:p>
+    <w:bookmarkEnd w:id="11"/>
+    <w:bookmarkStart w:id="15" w:name="regional-comparison"/>
+    <w:p>
+      <w:pPr>
+        <w:pStyle w:val="Heading3"/>
+      </w:pPr>
+      <w:r>
+        <w:t xml:space="preserve">Regional Comparison</w:t>
       </w:r>
     </w:p>
     <w:p>
@@ -289,51 +611,447 @@
       </w:pPr>
       <w:r>
         <w:rPr>
-          <w:rStyle w:val="CommentTok"/>
-        </w:rPr>
-        <w:t xml:space="preserve"># Import data.</w:t>
-      </w:r>
-      <w:r>
-        <w:br/>
-      </w:r>
-      <w:r>
-        <w:br/>
-      </w:r>
-      <w:r>
-        <w:rPr>
           <w:rStyle w:val="NormalTok"/>
         </w:rPr>
         <w:t xml:space="preserve">customer_data </w:t>
       </w:r>
       <w:r>
         <w:rPr>
+          <w:rStyle w:val="SpecialCharTok"/>
+        </w:rPr>
+        <w:t xml:space="preserve">|&gt;</w:t>
+      </w:r>
+      <w:r>
+        <w:br/>
+      </w:r>
+      <w:r>
+        <w:rPr>
+          <w:rStyle w:val="NormalTok"/>
+        </w:rPr>
+        <w:t xml:space="preserve">  </w:t>
+      </w:r>
+      <w:r>
+        <w:rPr>
+          <w:rStyle w:val="FunctionTok"/>
+        </w:rPr>
+        <w:t xml:space="preserve">count</w:t>
+      </w:r>
+      <w:r>
+        <w:rPr>
+          <w:rStyle w:val="NormalTok"/>
+        </w:rPr>
+        <w:t xml:space="preserve">(region, college_degree) </w:t>
+      </w:r>
+      <w:r>
+        <w:rPr>
+          <w:rStyle w:val="SpecialCharTok"/>
+        </w:rPr>
+        <w:t xml:space="preserve">|&gt;</w:t>
+      </w:r>
+      <w:r>
+        <w:br/>
+      </w:r>
+      <w:r>
+        <w:rPr>
+          <w:rStyle w:val="NormalTok"/>
+        </w:rPr>
+        <w:t xml:space="preserve">  </w:t>
+      </w:r>
+      <w:r>
+        <w:rPr>
+          <w:rStyle w:val="FunctionTok"/>
+        </w:rPr>
+        <w:t xml:space="preserve">ggplot</w:t>
+      </w:r>
+      <w:r>
+        <w:rPr>
+          <w:rStyle w:val="NormalTok"/>
+        </w:rPr>
+        <w:t xml:space="preserve">(</w:t>
+      </w:r>
+      <w:r>
+        <w:rPr>
+          <w:rStyle w:val="FunctionTok"/>
+        </w:rPr>
+        <w:t xml:space="preserve">aes</w:t>
+      </w:r>
+      <w:r>
+        <w:rPr>
+          <w:rStyle w:val="NormalTok"/>
+        </w:rPr>
+        <w:t xml:space="preserve">(</w:t>
+      </w:r>
+      <w:r>
+        <w:rPr>
+          <w:rStyle w:val="AttributeTok"/>
+        </w:rPr>
+        <w:t xml:space="preserve">x =</w:t>
+      </w:r>
+      <w:r>
+        <w:rPr>
+          <w:rStyle w:val="NormalTok"/>
+        </w:rPr>
+        <w:t xml:space="preserve"> region, </w:t>
+      </w:r>
+      <w:r>
+        <w:rPr>
+          <w:rStyle w:val="AttributeTok"/>
+        </w:rPr>
+        <w:t xml:space="preserve">y =</w:t>
+      </w:r>
+      <w:r>
+        <w:rPr>
+          <w:rStyle w:val="NormalTok"/>
+        </w:rPr>
+        <w:t xml:space="preserve"> n, </w:t>
+      </w:r>
+      <w:r>
+        <w:rPr>
+          <w:rStyle w:val="AttributeTok"/>
+        </w:rPr>
+        <w:t xml:space="preserve">fill =</w:t>
+      </w:r>
+      <w:r>
+        <w:rPr>
+          <w:rStyle w:val="NormalTok"/>
+        </w:rPr>
+        <w:t xml:space="preserve"> college_degree)) </w:t>
+      </w:r>
+      <w:r>
+        <w:rPr>
+          <w:rStyle w:val="SpecialCharTok"/>
+        </w:rPr>
+        <w:t xml:space="preserve">+</w:t>
+      </w:r>
+      <w:r>
+        <w:br/>
+      </w:r>
+      <w:r>
+        <w:rPr>
+          <w:rStyle w:val="NormalTok"/>
+        </w:rPr>
+        <w:t xml:space="preserve">  </w:t>
+      </w:r>
+      <w:r>
+        <w:rPr>
+          <w:rStyle w:val="FunctionTok"/>
+        </w:rPr>
+        <w:t xml:space="preserve">geom_col</w:t>
+      </w:r>
+      <w:r>
+        <w:rPr>
+          <w:rStyle w:val="NormalTok"/>
+        </w:rPr>
+        <w:t xml:space="preserve">(</w:t>
+      </w:r>
+      <w:r>
+        <w:rPr>
+          <w:rStyle w:val="AttributeTok"/>
+        </w:rPr>
+        <w:t xml:space="preserve">position =</w:t>
+      </w:r>
+      <w:r>
+        <w:rPr>
+          <w:rStyle w:val="NormalTok"/>
+        </w:rPr>
+        <w:t xml:space="preserve"> </w:t>
+      </w:r>
+      <w:r>
+        <w:rPr>
+          <w:rStyle w:val="StringTok"/>
+        </w:rPr>
+        <w:t xml:space="preserve">"fill"</w:t>
+      </w:r>
+      <w:r>
+        <w:rPr>
+          <w:rStyle w:val="NormalTok"/>
+        </w:rPr>
+        <w:t xml:space="preserve">) </w:t>
+      </w:r>
+      <w:r>
+        <w:rPr>
+          <w:rStyle w:val="SpecialCharTok"/>
+        </w:rPr>
+        <w:t xml:space="preserve">+</w:t>
+      </w:r>
+      <w:r>
+        <w:br/>
+      </w:r>
+      <w:r>
+        <w:rPr>
+          <w:rStyle w:val="NormalTok"/>
+        </w:rPr>
+        <w:t xml:space="preserve">  </w:t>
+      </w:r>
+      <w:r>
+        <w:rPr>
+          <w:rStyle w:val="FunctionTok"/>
+        </w:rPr>
+        <w:t xml:space="preserve">labs</w:t>
+      </w:r>
+      <w:r>
+        <w:rPr>
+          <w:rStyle w:val="NormalTok"/>
+        </w:rPr>
+        <w:t xml:space="preserve">(</w:t>
+      </w:r>
+      <w:r>
+        <w:br/>
+      </w:r>
+      <w:r>
+        <w:rPr>
+          <w:rStyle w:val="NormalTok"/>
+        </w:rPr>
+        <w:t xml:space="preserve">    </w:t>
+      </w:r>
+      <w:r>
+        <w:rPr>
+          <w:rStyle w:val="AttributeTok"/>
+        </w:rPr>
+        <w:t xml:space="preserve">title =</w:t>
+      </w:r>
+      <w:r>
+        <w:rPr>
+          <w:rStyle w:val="NormalTok"/>
+        </w:rPr>
+        <w:t xml:space="preserve"> </w:t>
+      </w:r>
+      <w:r>
+        <w:rPr>
+          <w:rStyle w:val="StringTok"/>
+        </w:rPr>
+        <w:t xml:space="preserve">"College-Degree Status by Region"</w:t>
+      </w:r>
+      <w:r>
+        <w:rPr>
+          <w:rStyle w:val="NormalTok"/>
+        </w:rPr>
+        <w:t xml:space="preserve">,</w:t>
+      </w:r>
+      <w:r>
+        <w:br/>
+      </w:r>
+      <w:r>
+        <w:rPr>
+          <w:rStyle w:val="NormalTok"/>
+        </w:rPr>
+        <w:t xml:space="preserve">    </w:t>
+      </w:r>
+      <w:r>
+        <w:rPr>
+          <w:rStyle w:val="AttributeTok"/>
+        </w:rPr>
+        <w:t xml:space="preserve">subtitle =</w:t>
+      </w:r>
+      <w:r>
+        <w:rPr>
+          <w:rStyle w:val="NormalTok"/>
+        </w:rPr>
+        <w:t xml:space="preserve"> </w:t>
+      </w:r>
+      <w:r>
+        <w:rPr>
+          <w:rStyle w:val="StringTok"/>
+        </w:rPr>
+        <w:t xml:space="preserve">"10,531 customers in the CRM database"</w:t>
+      </w:r>
+      <w:r>
+        <w:rPr>
+          <w:rStyle w:val="NormalTok"/>
+        </w:rPr>
+        <w:t xml:space="preserve">,</w:t>
+      </w:r>
+      <w:r>
+        <w:br/>
+      </w:r>
+      <w:r>
+        <w:rPr>
+          <w:rStyle w:val="NormalTok"/>
+        </w:rPr>
+        <w:t xml:space="preserve">    </w:t>
+      </w:r>
+      <w:r>
+        <w:rPr>
+          <w:rStyle w:val="AttributeTok"/>
+        </w:rPr>
+        <w:t xml:space="preserve">x =</w:t>
+      </w:r>
+      <w:r>
+        <w:rPr>
+          <w:rStyle w:val="NormalTok"/>
+        </w:rPr>
+        <w:t xml:space="preserve"> </w:t>
+      </w:r>
+      <w:r>
+        <w:rPr>
+          <w:rStyle w:val="StringTok"/>
+        </w:rPr>
+        <w:t xml:space="preserve">"Region"</w:t>
+      </w:r>
+      <w:r>
+        <w:rPr>
+          <w:rStyle w:val="NormalTok"/>
+        </w:rPr>
+        <w:t xml:space="preserve">,</w:t>
+      </w:r>
+      <w:r>
+        <w:br/>
+      </w:r>
+      <w:r>
+        <w:rPr>
+          <w:rStyle w:val="NormalTok"/>
+        </w:rPr>
+        <w:t xml:space="preserve">    </w:t>
+      </w:r>
+      <w:r>
+        <w:rPr>
+          <w:rStyle w:val="AttributeTok"/>
+        </w:rPr>
+        <w:t xml:space="preserve">y =</w:t>
+      </w:r>
+      <w:r>
+        <w:rPr>
+          <w:rStyle w:val="NormalTok"/>
+        </w:rPr>
+        <w:t xml:space="preserve"> </w:t>
+      </w:r>
+      <w:r>
+        <w:rPr>
+          <w:rStyle w:val="StringTok"/>
+        </w:rPr>
+        <w:t xml:space="preserve">"Proportion of Customers"</w:t>
+      </w:r>
+      <w:r>
+        <w:br/>
+      </w:r>
+      <w:r>
+        <w:rPr>
+          <w:rStyle w:val="NormalTok"/>
+        </w:rPr>
+        <w:t xml:space="preserve">  ) </w:t>
+      </w:r>
+      <w:r>
+        <w:rPr>
+          <w:rStyle w:val="SpecialCharTok"/>
+        </w:rPr>
+        <w:t xml:space="preserve">+</w:t>
+      </w:r>
+      <w:r>
+        <w:br/>
+      </w:r>
+      <w:r>
+        <w:rPr>
+          <w:rStyle w:val="NormalTok"/>
+        </w:rPr>
+        <w:t xml:space="preserve">  </w:t>
+      </w:r>
+      <w:r>
+        <w:rPr>
+          <w:rStyle w:val="FunctionTok"/>
+        </w:rPr>
+        <w:t xml:space="preserve">scale_fill_manual</w:t>
+      </w:r>
+      <w:r>
+        <w:rPr>
+          <w:rStyle w:val="NormalTok"/>
+        </w:rPr>
+        <w:t xml:space="preserve">(</w:t>
+      </w:r>
+      <w:r>
+        <w:br/>
+      </w:r>
+      <w:r>
+        <w:rPr>
+          <w:rStyle w:val="NormalTok"/>
+        </w:rPr>
+        <w:t xml:space="preserve">    </w:t>
+      </w:r>
+      <w:r>
+        <w:rPr>
+          <w:rStyle w:val="AttributeTok"/>
+        </w:rPr>
+        <w:t xml:space="preserve">name =</w:t>
+      </w:r>
+      <w:r>
+        <w:rPr>
+          <w:rStyle w:val="NormalTok"/>
+        </w:rPr>
+        <w:t xml:space="preserve"> </w:t>
+      </w:r>
+      <w:r>
+        <w:rPr>
+          <w:rStyle w:val="StringTok"/>
+        </w:rPr>
+        <w:t xml:space="preserve">"College Degree"</w:t>
+      </w:r>
+      <w:r>
+        <w:rPr>
+          <w:rStyle w:val="NormalTok"/>
+        </w:rPr>
+        <w:t xml:space="preserve">,</w:t>
+      </w:r>
+      <w:r>
+        <w:br/>
+      </w:r>
+      <w:r>
+        <w:rPr>
+          <w:rStyle w:val="NormalTok"/>
+        </w:rPr>
+        <w:t xml:space="preserve">    </w:t>
+      </w:r>
+      <w:r>
+        <w:rPr>
+          <w:rStyle w:val="AttributeTok"/>
+        </w:rPr>
+        <w:t xml:space="preserve">values =</w:t>
+      </w:r>
+      <w:r>
+        <w:rPr>
+          <w:rStyle w:val="NormalTok"/>
+        </w:rPr>
+        <w:t xml:space="preserve"> </w:t>
+      </w:r>
+      <w:r>
+        <w:rPr>
+          <w:rStyle w:val="FunctionTok"/>
+        </w:rPr>
+        <w:t xml:space="preserve">c</w:t>
+      </w:r>
+      <w:r>
+        <w:rPr>
+          <w:rStyle w:val="NormalTok"/>
+        </w:rPr>
+        <w:t xml:space="preserve">(</w:t>
+      </w:r>
+      <w:r>
+        <w:rPr>
+          <w:rStyle w:val="StringTok"/>
+        </w:rPr>
+        <w:t xml:space="preserve">"No"</w:t>
+      </w:r>
+      <w:r>
+        <w:rPr>
+          <w:rStyle w:val="NormalTok"/>
+        </w:rPr>
+        <w:t xml:space="preserve"> </w:t>
+      </w:r>
+      <w:r>
+        <w:rPr>
           <w:rStyle w:val="OtherTok"/>
         </w:rPr>
-        <w:t xml:space="preserve">&lt;-</w:t>
-      </w:r>
-      <w:r>
-        <w:rPr>
-          <w:rStyle w:val="NormalTok"/>
-        </w:rPr>
-        <w:t xml:space="preserve"> </w:t>
-      </w:r>
-      <w:r>
-        <w:rPr>
-          <w:rStyle w:val="FunctionTok"/>
-        </w:rPr>
-        <w:t xml:space="preserve">read_csv</w:t>
-      </w:r>
-      <w:r>
-        <w:rPr>
-          <w:rStyle w:val="NormalTok"/>
-        </w:rPr>
-        <w:t xml:space="preserve">(</w:t>
+        <w:t xml:space="preserve">=</w:t>
+      </w:r>
+      <w:r>
+        <w:rPr>
+          <w:rStyle w:val="NormalTok"/>
+        </w:rPr>
+        <w:t xml:space="preserve"> </w:t>
       </w:r>
       <w:r>
         <w:rPr>
           <w:rStyle w:val="StringTok"/>
         </w:rPr>
-        <w:t xml:space="preserve">"customer_data.csv"</w:t>
+        <w:t xml:space="preserve">"cornflowerblue"</w:t>
       </w:r>
       <w:r>
         <w:rPr>
@@ -343,21 +1061,33 @@
       </w:r>
       <w:r>
         <w:rPr>
-          <w:rStyle w:val="AttributeTok"/>
-        </w:rPr>
-        <w:t xml:space="preserve">show_col_types =</w:t>
-      </w:r>
-      <w:r>
-        <w:rPr>
-          <w:rStyle w:val="NormalTok"/>
-        </w:rPr>
-        <w:t xml:space="preserve"> </w:t>
-      </w:r>
-      <w:r>
-        <w:rPr>
-          <w:rStyle w:val="ConstantTok"/>
-        </w:rPr>
-        <w:t xml:space="preserve">FALSE</w:t>
+          <w:rStyle w:val="StringTok"/>
+        </w:rPr>
+        <w:t xml:space="preserve">"Yes"</w:t>
+      </w:r>
+      <w:r>
+        <w:rPr>
+          <w:rStyle w:val="NormalTok"/>
+        </w:rPr>
+        <w:t xml:space="preserve"> </w:t>
+      </w:r>
+      <w:r>
+        <w:rPr>
+          <w:rStyle w:val="OtherTok"/>
+        </w:rPr>
+        <w:t xml:space="preserve">=</w:t>
+      </w:r>
+      <w:r>
+        <w:rPr>
+          <w:rStyle w:val="NormalTok"/>
+        </w:rPr>
+        <w:t xml:space="preserve"> </w:t>
+      </w:r>
+      <w:r>
+        <w:rPr>
+          <w:rStyle w:val="StringTok"/>
+        </w:rPr>
+        <w:t xml:space="preserve">"navy"</w:t>
       </w:r>
       <w:r>
         <w:rPr>
@@ -369,980 +1099,10 @@
         <w:br/>
       </w:r>
       <w:r>
-        <w:br/>
-      </w:r>
-      <w:r>
-        <w:rPr>
-          <w:rStyle w:val="NormalTok"/>
-        </w:rPr>
-        <w:t xml:space="preserve">customer_data</w:t>
-      </w:r>
-    </w:p>
-    <w:p>
-      <w:pPr>
-        <w:pStyle w:val="SourceCode"/>
-      </w:pPr>
-      <w:r>
-        <w:rPr>
-          <w:rStyle w:val="VerbatimChar"/>
-        </w:rPr>
-        <w:t xml:space="preserve"># A tibble: 10,531 × 14</w:t>
-      </w:r>
-      <w:r>
-        <w:br/>
-      </w:r>
-      <w:r>
-        <w:rPr>
-          <w:rStyle w:val="VerbatimChar"/>
-        </w:rPr>
-        <w:t xml:space="preserve">   customer_id birth_year gender income credit married college_degree region   </w:t>
-      </w:r>
-      <w:r>
-        <w:br/>
-      </w:r>
-      <w:r>
-        <w:rPr>
-          <w:rStyle w:val="VerbatimChar"/>
-        </w:rPr>
-        <w:t xml:space="preserve">         &lt;dbl&gt;      &lt;dbl&gt; &lt;chr&gt;   &lt;dbl&gt;  &lt;dbl&gt; &lt;chr&gt;   &lt;chr&gt;          &lt;chr&gt;    </w:t>
-      </w:r>
-      <w:r>
-        <w:br/>
-      </w:r>
-      <w:r>
-        <w:rPr>
-          <w:rStyle w:val="VerbatimChar"/>
-        </w:rPr>
-        <w:t xml:space="preserve"> 1        1001       1971 Female  73000   742. No      No             South    </w:t>
-      </w:r>
-      <w:r>
-        <w:br/>
-      </w:r>
-      <w:r>
-        <w:rPr>
-          <w:rStyle w:val="VerbatimChar"/>
-        </w:rPr>
-        <w:t xml:space="preserve"> 2        1002       1970 Female  31000   749. Yes     No             West     </w:t>
-      </w:r>
-      <w:r>
-        <w:br/>
-      </w:r>
-      <w:r>
-        <w:rPr>
-          <w:rStyle w:val="VerbatimChar"/>
-        </w:rPr>
-        <w:t xml:space="preserve"> 3        1003       1988 Male    35000   542. No      No             South    </w:t>
-      </w:r>
-      <w:r>
-        <w:br/>
-      </w:r>
-      <w:r>
-        <w:rPr>
-          <w:rStyle w:val="VerbatimChar"/>
-        </w:rPr>
-        <w:t xml:space="preserve"> 4        1004       1984 Other   64000   574. Yes     Yes            Midwest  </w:t>
-      </w:r>
-      <w:r>
-        <w:br/>
-      </w:r>
-      <w:r>
-        <w:rPr>
-          <w:rStyle w:val="VerbatimChar"/>
-        </w:rPr>
-        <w:t xml:space="preserve"> 5        1005       1987 Male    58000   644. No      Yes            West     </w:t>
-      </w:r>
-      <w:r>
-        <w:br/>
-      </w:r>
-      <w:r>
-        <w:rPr>
-          <w:rStyle w:val="VerbatimChar"/>
-        </w:rPr>
-        <w:t xml:space="preserve"> 6        1006       1994 Male   164000   554. Yes     Yes            Midwest  </w:t>
-      </w:r>
-      <w:r>
-        <w:br/>
-      </w:r>
-      <w:r>
-        <w:rPr>
-          <w:rStyle w:val="VerbatimChar"/>
-        </w:rPr>
-        <w:t xml:space="preserve"> 7        1007       1968 Male    39000   608. No      No             Midwest  </w:t>
-      </w:r>
-      <w:r>
-        <w:br/>
-      </w:r>
-      <w:r>
-        <w:rPr>
-          <w:rStyle w:val="VerbatimChar"/>
-        </w:rPr>
-        <w:t xml:space="preserve"> 8        1008       1994 Male    69000   710. No      No             South    </w:t>
-      </w:r>
-      <w:r>
-        <w:br/>
-      </w:r>
-      <w:r>
-        <w:rPr>
-          <w:rStyle w:val="VerbatimChar"/>
-        </w:rPr>
-        <w:t xml:space="preserve"> 9        1009       1958 Male   233000   702. No      No             West     </w:t>
-      </w:r>
-      <w:r>
-        <w:br/>
-      </w:r>
-      <w:r>
-        <w:rPr>
-          <w:rStyle w:val="VerbatimChar"/>
-        </w:rPr>
-        <w:t xml:space="preserve">10        1010       1994 Female  77000   605. Yes     No             Northeast</w:t>
-      </w:r>
-      <w:r>
-        <w:br/>
-      </w:r>
-      <w:r>
-        <w:rPr>
-          <w:rStyle w:val="VerbatimChar"/>
-        </w:rPr>
-        <w:t xml:space="preserve"># ℹ 10,521 more rows</w:t>
-      </w:r>
-      <w:r>
-        <w:br/>
-      </w:r>
-      <w:r>
-        <w:rPr>
-          <w:rStyle w:val="VerbatimChar"/>
-        </w:rPr>
-        <w:t xml:space="preserve"># ℹ 6 more variables: state &lt;chr&gt;, review_id &lt;dbl&gt;, star_rating &lt;dbl&gt;,</w:t>
-      </w:r>
-      <w:r>
-        <w:br/>
-      </w:r>
-      <w:r>
-        <w:rPr>
-          <w:rStyle w:val="VerbatimChar"/>
-        </w:rPr>
-        <w:t xml:space="preserve">#   review_time &lt;chr&gt;, review_title &lt;chr&gt;, review_text &lt;chr&gt;</w:t>
-      </w:r>
-    </w:p>
-    <w:p>
-      <w:pPr>
-        <w:pStyle w:val="SourceCode"/>
-      </w:pPr>
-      <w:r>
-        <w:rPr>
-          <w:rStyle w:val="CommentTok"/>
-        </w:rPr>
-        <w:t xml:space="preserve"># At least one interesting numeric summary. For example, the number of "high income" customers by gender.</w:t>
-      </w:r>
-      <w:r>
-        <w:br/>
-      </w:r>
-      <w:r>
-        <w:br/>
-      </w:r>
-      <w:r>
-        <w:rPr>
-          <w:rStyle w:val="NormalTok"/>
-        </w:rPr>
-        <w:t xml:space="preserve">customer_data </w:t>
-      </w:r>
-      <w:r>
-        <w:rPr>
-          <w:rStyle w:val="SpecialCharTok"/>
-        </w:rPr>
-        <w:t xml:space="preserve">|&gt;</w:t>
-      </w:r>
-      <w:r>
-        <w:rPr>
-          <w:rStyle w:val="NormalTok"/>
-        </w:rPr>
-        <w:t xml:space="preserve"> </w:t>
-      </w:r>
-      <w:r>
-        <w:br/>
-      </w:r>
-      <w:r>
-        <w:rPr>
-          <w:rStyle w:val="NormalTok"/>
-        </w:rPr>
-        <w:t xml:space="preserve">  </w:t>
-      </w:r>
-      <w:r>
-        <w:rPr>
-          <w:rStyle w:val="FunctionTok"/>
-        </w:rPr>
-        <w:t xml:space="preserve">mutate</w:t>
-      </w:r>
-      <w:r>
-        <w:rPr>
-          <w:rStyle w:val="NormalTok"/>
-        </w:rPr>
-        <w:t xml:space="preserve">(</w:t>
-      </w:r>
-      <w:r>
-        <w:rPr>
-          <w:rStyle w:val="AttributeTok"/>
-        </w:rPr>
-        <w:t xml:space="preserve">high_income =</w:t>
-      </w:r>
-      <w:r>
-        <w:rPr>
-          <w:rStyle w:val="NormalTok"/>
-        </w:rPr>
-        <w:t xml:space="preserve"> income </w:t>
-      </w:r>
-      <w:r>
-        <w:rPr>
-          <w:rStyle w:val="SpecialCharTok"/>
-        </w:rPr>
-        <w:t xml:space="preserve">&gt;</w:t>
-      </w:r>
-      <w:r>
-        <w:rPr>
-          <w:rStyle w:val="NormalTok"/>
-        </w:rPr>
-        <w:t xml:space="preserve"> </w:t>
-      </w:r>
-      <w:r>
-        <w:rPr>
-          <w:rStyle w:val="DecValTok"/>
-        </w:rPr>
-        <w:t xml:space="preserve">120000</w:t>
-      </w:r>
-      <w:r>
-        <w:rPr>
-          <w:rStyle w:val="NormalTok"/>
-        </w:rPr>
-        <w:t xml:space="preserve">) </w:t>
-      </w:r>
-      <w:r>
-        <w:rPr>
-          <w:rStyle w:val="SpecialCharTok"/>
-        </w:rPr>
-        <w:t xml:space="preserve">|&gt;</w:t>
-      </w:r>
-      <w:r>
-        <w:rPr>
-          <w:rStyle w:val="NormalTok"/>
-        </w:rPr>
-        <w:t xml:space="preserve"> </w:t>
-      </w:r>
-      <w:r>
-        <w:br/>
-      </w:r>
-      <w:r>
-        <w:rPr>
-          <w:rStyle w:val="NormalTok"/>
-        </w:rPr>
-        <w:t xml:space="preserve">  </w:t>
-      </w:r>
-      <w:r>
-        <w:rPr>
-          <w:rStyle w:val="FunctionTok"/>
-        </w:rPr>
-        <w:t xml:space="preserve">count</w:t>
-      </w:r>
-      <w:r>
-        <w:rPr>
-          <w:rStyle w:val="NormalTok"/>
-        </w:rPr>
-        <w:t xml:space="preserve">(gender, high_income) </w:t>
-      </w:r>
-      <w:r>
-        <w:rPr>
-          <w:rStyle w:val="SpecialCharTok"/>
-        </w:rPr>
-        <w:t xml:space="preserve">|&gt;</w:t>
-      </w:r>
-      <w:r>
-        <w:rPr>
-          <w:rStyle w:val="NormalTok"/>
-        </w:rPr>
-        <w:t xml:space="preserve"> </w:t>
-      </w:r>
-      <w:r>
-        <w:br/>
-      </w:r>
-      <w:r>
-        <w:rPr>
-          <w:rStyle w:val="NormalTok"/>
-        </w:rPr>
-        <w:t xml:space="preserve">  </w:t>
-      </w:r>
-      <w:r>
-        <w:rPr>
-          <w:rStyle w:val="FunctionTok"/>
-        </w:rPr>
-        <w:t xml:space="preserve">arrange</w:t>
-      </w:r>
-      <w:r>
-        <w:rPr>
-          <w:rStyle w:val="NormalTok"/>
-        </w:rPr>
-        <w:t xml:space="preserve">(</w:t>
-      </w:r>
-      <w:r>
-        <w:rPr>
-          <w:rStyle w:val="FunctionTok"/>
-        </w:rPr>
-        <w:t xml:space="preserve">desc</w:t>
-      </w:r>
-      <w:r>
-        <w:rPr>
-          <w:rStyle w:val="NormalTok"/>
-        </w:rPr>
-        <w:t xml:space="preserve">(n))</w:t>
-      </w:r>
-    </w:p>
-    <w:p>
-      <w:pPr>
-        <w:pStyle w:val="SourceCode"/>
-      </w:pPr>
-      <w:r>
-        <w:rPr>
-          <w:rStyle w:val="VerbatimChar"/>
-        </w:rPr>
-        <w:t xml:space="preserve"># A tibble: 6 × 3</w:t>
-      </w:r>
-      <w:r>
-        <w:br/>
-      </w:r>
-      <w:r>
-        <w:rPr>
-          <w:rStyle w:val="VerbatimChar"/>
-        </w:rPr>
-        <w:t xml:space="preserve">  gender high_income     n</w:t>
-      </w:r>
-      <w:r>
-        <w:br/>
-      </w:r>
-      <w:r>
-        <w:rPr>
-          <w:rStyle w:val="VerbatimChar"/>
-        </w:rPr>
-        <w:t xml:space="preserve">  &lt;chr&gt;  &lt;lgl&gt;       &lt;int&gt;</w:t>
-      </w:r>
-      <w:r>
-        <w:br/>
-      </w:r>
-      <w:r>
-        <w:rPr>
-          <w:rStyle w:val="VerbatimChar"/>
-        </w:rPr>
-        <w:t xml:space="preserve">1 Female TRUE         2858</w:t>
-      </w:r>
-      <w:r>
-        <w:br/>
-      </w:r>
-      <w:r>
-        <w:rPr>
-          <w:rStyle w:val="VerbatimChar"/>
-        </w:rPr>
-        <w:t xml:space="preserve">2 Male   TRUE         2686</w:t>
-      </w:r>
-      <w:r>
-        <w:br/>
-      </w:r>
-      <w:r>
-        <w:rPr>
-          <w:rStyle w:val="VerbatimChar"/>
-        </w:rPr>
-        <w:t xml:space="preserve">3 Female FALSE        2361</w:t>
-      </w:r>
-      <w:r>
-        <w:br/>
-      </w:r>
-      <w:r>
-        <w:rPr>
-          <w:rStyle w:val="VerbatimChar"/>
-        </w:rPr>
-        <w:t xml:space="preserve">4 Male   FALSE        1528</w:t>
-      </w:r>
-      <w:r>
-        <w:br/>
-      </w:r>
-      <w:r>
-        <w:rPr>
-          <w:rStyle w:val="VerbatimChar"/>
-        </w:rPr>
-        <w:t xml:space="preserve">5 Other  TRUE          677</w:t>
-      </w:r>
-      <w:r>
-        <w:br/>
-      </w:r>
-      <w:r>
-        <w:rPr>
-          <w:rStyle w:val="VerbatimChar"/>
-        </w:rPr>
-        <w:t xml:space="preserve">6 Other  FALSE         421</w:t>
-      </w:r>
-    </w:p>
-    <w:p>
-      <w:pPr>
-        <w:pStyle w:val="SourceCode"/>
-      </w:pPr>
-      <w:r>
-        <w:rPr>
-          <w:rStyle w:val="CommentTok"/>
-        </w:rPr>
-        <w:t xml:space="preserve"># At least one interesting visualization. For example, the top 10 most commonly used words for 5-star reviews.</w:t>
-      </w:r>
-      <w:r>
-        <w:br/>
-      </w:r>
-      <w:r>
-        <w:br/>
-      </w:r>
-      <w:r>
-        <w:rPr>
-          <w:rStyle w:val="NormalTok"/>
-        </w:rPr>
-        <w:t xml:space="preserve">customer_data </w:t>
-      </w:r>
-      <w:r>
-        <w:rPr>
-          <w:rStyle w:val="SpecialCharTok"/>
-        </w:rPr>
-        <w:t xml:space="preserve">|&gt;</w:t>
-      </w:r>
-      <w:r>
-        <w:br/>
-      </w:r>
-      <w:r>
-        <w:rPr>
-          <w:rStyle w:val="NormalTok"/>
-        </w:rPr>
-        <w:t xml:space="preserve">  </w:t>
-      </w:r>
-      <w:r>
-        <w:rPr>
-          <w:rStyle w:val="FunctionTok"/>
-        </w:rPr>
-        <w:t xml:space="preserve">filter</w:t>
-      </w:r>
-      <w:r>
-        <w:rPr>
-          <w:rStyle w:val="NormalTok"/>
-        </w:rPr>
-        <w:t xml:space="preserve">(star_rating </w:t>
-      </w:r>
-      <w:r>
-        <w:rPr>
-          <w:rStyle w:val="SpecialCharTok"/>
-        </w:rPr>
-        <w:t xml:space="preserve">==</w:t>
-      </w:r>
-      <w:r>
-        <w:rPr>
-          <w:rStyle w:val="NormalTok"/>
-        </w:rPr>
-        <w:t xml:space="preserve"> </w:t>
-      </w:r>
-      <w:r>
-        <w:rPr>
-          <w:rStyle w:val="DecValTok"/>
-        </w:rPr>
-        <w:t xml:space="preserve">5</w:t>
-      </w:r>
-      <w:r>
-        <w:rPr>
-          <w:rStyle w:val="NormalTok"/>
-        </w:rPr>
-        <w:t xml:space="preserve">) </w:t>
-      </w:r>
-      <w:r>
-        <w:rPr>
-          <w:rStyle w:val="SpecialCharTok"/>
-        </w:rPr>
-        <w:t xml:space="preserve">|&gt;</w:t>
-      </w:r>
-      <w:r>
-        <w:rPr>
-          <w:rStyle w:val="NormalTok"/>
-        </w:rPr>
-        <w:t xml:space="preserve"> </w:t>
-      </w:r>
-      <w:r>
-        <w:br/>
-      </w:r>
-      <w:r>
-        <w:rPr>
-          <w:rStyle w:val="NormalTok"/>
-        </w:rPr>
-        <w:t xml:space="preserve">  </w:t>
-      </w:r>
-      <w:r>
-        <w:rPr>
-          <w:rStyle w:val="FunctionTok"/>
-        </w:rPr>
-        <w:t xml:space="preserve">select</w:t>
-      </w:r>
-      <w:r>
-        <w:rPr>
-          <w:rStyle w:val="NormalTok"/>
-        </w:rPr>
-        <w:t xml:space="preserve">(review_text) </w:t>
-      </w:r>
-      <w:r>
-        <w:rPr>
-          <w:rStyle w:val="SpecialCharTok"/>
-        </w:rPr>
-        <w:t xml:space="preserve">|&gt;</w:t>
-      </w:r>
-      <w:r>
-        <w:rPr>
-          <w:rStyle w:val="NormalTok"/>
-        </w:rPr>
-        <w:t xml:space="preserve"> </w:t>
-      </w:r>
-      <w:r>
-        <w:br/>
-      </w:r>
-      <w:r>
-        <w:rPr>
-          <w:rStyle w:val="NormalTok"/>
-        </w:rPr>
-        <w:t xml:space="preserve">  tidytext</w:t>
-      </w:r>
-      <w:r>
-        <w:rPr>
-          <w:rStyle w:val="SpecialCharTok"/>
-        </w:rPr>
-        <w:t xml:space="preserve">::</w:t>
-      </w:r>
-      <w:r>
-        <w:rPr>
-          <w:rStyle w:val="FunctionTok"/>
-        </w:rPr>
-        <w:t xml:space="preserve">unnest_tokens</w:t>
-      </w:r>
-      <w:r>
-        <w:rPr>
-          <w:rStyle w:val="NormalTok"/>
-        </w:rPr>
-        <w:t xml:space="preserve">(word, review_text) </w:t>
-      </w:r>
-      <w:r>
-        <w:rPr>
-          <w:rStyle w:val="SpecialCharTok"/>
-        </w:rPr>
-        <w:t xml:space="preserve">|&gt;</w:t>
-      </w:r>
-      <w:r>
-        <w:rPr>
-          <w:rStyle w:val="NormalTok"/>
-        </w:rPr>
-        <w:t xml:space="preserve"> </w:t>
-      </w:r>
-      <w:r>
-        <w:br/>
-      </w:r>
-      <w:r>
-        <w:rPr>
-          <w:rStyle w:val="NormalTok"/>
-        </w:rPr>
-        <w:t xml:space="preserve">  </w:t>
-      </w:r>
-      <w:r>
-        <w:rPr>
-          <w:rStyle w:val="FunctionTok"/>
-        </w:rPr>
-        <w:t xml:space="preserve">drop_na</w:t>
-      </w:r>
-      <w:r>
-        <w:rPr>
-          <w:rStyle w:val="NormalTok"/>
-        </w:rPr>
-        <w:t xml:space="preserve">(word) </w:t>
-      </w:r>
-      <w:r>
-        <w:rPr>
-          <w:rStyle w:val="SpecialCharTok"/>
-        </w:rPr>
-        <w:t xml:space="preserve">|&gt;</w:t>
-      </w:r>
-      <w:r>
-        <w:rPr>
-          <w:rStyle w:val="NormalTok"/>
-        </w:rPr>
-        <w:t xml:space="preserve"> </w:t>
-      </w:r>
-      <w:r>
-        <w:br/>
-      </w:r>
-      <w:r>
-        <w:rPr>
-          <w:rStyle w:val="NormalTok"/>
-        </w:rPr>
-        <w:t xml:space="preserve">  </w:t>
-      </w:r>
-      <w:r>
-        <w:rPr>
-          <w:rStyle w:val="FunctionTok"/>
-        </w:rPr>
-        <w:t xml:space="preserve">anti_join</w:t>
-      </w:r>
-      <w:r>
-        <w:rPr>
-          <w:rStyle w:val="NormalTok"/>
-        </w:rPr>
-        <w:t xml:space="preserve">(tidytext</w:t>
-      </w:r>
-      <w:r>
-        <w:rPr>
-          <w:rStyle w:val="SpecialCharTok"/>
-        </w:rPr>
-        <w:t xml:space="preserve">::</w:t>
-      </w:r>
-      <w:r>
-        <w:rPr>
-          <w:rStyle w:val="NormalTok"/>
-        </w:rPr>
-        <w:t xml:space="preserve">stop_words) </w:t>
-      </w:r>
-      <w:r>
-        <w:rPr>
-          <w:rStyle w:val="SpecialCharTok"/>
-        </w:rPr>
-        <w:t xml:space="preserve">|&gt;</w:t>
-      </w:r>
-      <w:r>
-        <w:rPr>
-          <w:rStyle w:val="NormalTok"/>
-        </w:rPr>
-        <w:t xml:space="preserve"> </w:t>
-      </w:r>
-      <w:r>
-        <w:br/>
-      </w:r>
-      <w:r>
-        <w:rPr>
-          <w:rStyle w:val="NormalTok"/>
-        </w:rPr>
-        <w:t xml:space="preserve">  </w:t>
-      </w:r>
-      <w:r>
-        <w:rPr>
-          <w:rStyle w:val="FunctionTok"/>
-        </w:rPr>
-        <w:t xml:space="preserve">count</w:t>
-      </w:r>
-      <w:r>
-        <w:rPr>
-          <w:rStyle w:val="NormalTok"/>
-        </w:rPr>
-        <w:t xml:space="preserve">(word) </w:t>
-      </w:r>
-      <w:r>
-        <w:rPr>
-          <w:rStyle w:val="SpecialCharTok"/>
-        </w:rPr>
-        <w:t xml:space="preserve">|&gt;</w:t>
-      </w:r>
-      <w:r>
-        <w:rPr>
-          <w:rStyle w:val="NormalTok"/>
-        </w:rPr>
-        <w:t xml:space="preserve"> </w:t>
-      </w:r>
-      <w:r>
-        <w:br/>
-      </w:r>
-      <w:r>
-        <w:rPr>
-          <w:rStyle w:val="NormalTok"/>
-        </w:rPr>
-        <w:t xml:space="preserve">  </w:t>
-      </w:r>
-      <w:r>
-        <w:rPr>
-          <w:rStyle w:val="FunctionTok"/>
-        </w:rPr>
-        <w:t xml:space="preserve">arrange</w:t>
-      </w:r>
-      <w:r>
-        <w:rPr>
-          <w:rStyle w:val="NormalTok"/>
-        </w:rPr>
-        <w:t xml:space="preserve">(</w:t>
-      </w:r>
-      <w:r>
-        <w:rPr>
-          <w:rStyle w:val="FunctionTok"/>
-        </w:rPr>
-        <w:t xml:space="preserve">desc</w:t>
-      </w:r>
-      <w:r>
-        <w:rPr>
-          <w:rStyle w:val="NormalTok"/>
-        </w:rPr>
-        <w:t xml:space="preserve">(n)) </w:t>
-      </w:r>
-      <w:r>
-        <w:rPr>
-          <w:rStyle w:val="SpecialCharTok"/>
-        </w:rPr>
-        <w:t xml:space="preserve">|&gt;</w:t>
-      </w:r>
-      <w:r>
-        <w:rPr>
-          <w:rStyle w:val="NormalTok"/>
-        </w:rPr>
-        <w:t xml:space="preserve"> </w:t>
-      </w:r>
-      <w:r>
-        <w:br/>
-      </w:r>
-      <w:r>
-        <w:rPr>
-          <w:rStyle w:val="NormalTok"/>
-        </w:rPr>
-        <w:t xml:space="preserve">  </w:t>
-      </w:r>
-      <w:r>
-        <w:rPr>
-          <w:rStyle w:val="FunctionTok"/>
-        </w:rPr>
-        <w:t xml:space="preserve">slice</w:t>
-      </w:r>
-      <w:r>
-        <w:rPr>
-          <w:rStyle w:val="NormalTok"/>
-        </w:rPr>
-        <w:t xml:space="preserve">(</w:t>
-      </w:r>
-      <w:r>
-        <w:rPr>
-          <w:rStyle w:val="DecValTok"/>
-        </w:rPr>
-        <w:t xml:space="preserve">1</w:t>
-      </w:r>
-      <w:r>
-        <w:rPr>
-          <w:rStyle w:val="SpecialCharTok"/>
-        </w:rPr>
-        <w:t xml:space="preserve">:</w:t>
-      </w:r>
-      <w:r>
-        <w:rPr>
-          <w:rStyle w:val="DecValTok"/>
-        </w:rPr>
-        <w:t xml:space="preserve">10</w:t>
-      </w:r>
-      <w:r>
-        <w:rPr>
-          <w:rStyle w:val="NormalTok"/>
-        </w:rPr>
-        <w:t xml:space="preserve">) </w:t>
-      </w:r>
-      <w:r>
-        <w:rPr>
-          <w:rStyle w:val="SpecialCharTok"/>
-        </w:rPr>
-        <w:t xml:space="preserve">|&gt;</w:t>
-      </w:r>
-      <w:r>
-        <w:rPr>
-          <w:rStyle w:val="NormalTok"/>
-        </w:rPr>
-        <w:t xml:space="preserve"> </w:t>
-      </w:r>
-      <w:r>
-        <w:br/>
-      </w:r>
-      <w:r>
-        <w:rPr>
-          <w:rStyle w:val="NormalTok"/>
-        </w:rPr>
-        <w:t xml:space="preserve">  </w:t>
-      </w:r>
-      <w:r>
-        <w:rPr>
-          <w:rStyle w:val="FunctionTok"/>
-        </w:rPr>
-        <w:t xml:space="preserve">mutate</w:t>
-      </w:r>
-      <w:r>
-        <w:rPr>
-          <w:rStyle w:val="NormalTok"/>
-        </w:rPr>
-        <w:t xml:space="preserve">(</w:t>
-      </w:r>
-      <w:r>
-        <w:rPr>
-          <w:rStyle w:val="AttributeTok"/>
-        </w:rPr>
-        <w:t xml:space="preserve">word =</w:t>
-      </w:r>
-      <w:r>
-        <w:rPr>
-          <w:rStyle w:val="NormalTok"/>
-        </w:rPr>
-        <w:t xml:space="preserve"> </w:t>
-      </w:r>
-      <w:r>
-        <w:rPr>
-          <w:rStyle w:val="FunctionTok"/>
-        </w:rPr>
-        <w:t xml:space="preserve">fct_reorder</w:t>
-      </w:r>
-      <w:r>
-        <w:rPr>
-          <w:rStyle w:val="NormalTok"/>
-        </w:rPr>
-        <w:t xml:space="preserve">(word, n)) </w:t>
-      </w:r>
-      <w:r>
-        <w:rPr>
-          <w:rStyle w:val="SpecialCharTok"/>
-        </w:rPr>
-        <w:t xml:space="preserve">|&gt;</w:t>
-      </w:r>
-      <w:r>
-        <w:br/>
-      </w:r>
-      <w:r>
-        <w:rPr>
-          <w:rStyle w:val="NormalTok"/>
-        </w:rPr>
-        <w:t xml:space="preserve">  </w:t>
-      </w:r>
-      <w:r>
-        <w:rPr>
-          <w:rStyle w:val="FunctionTok"/>
-        </w:rPr>
-        <w:t xml:space="preserve">ggplot</w:t>
-      </w:r>
-      <w:r>
-        <w:rPr>
-          <w:rStyle w:val="NormalTok"/>
-        </w:rPr>
-        <w:t xml:space="preserve">(</w:t>
-      </w:r>
-      <w:r>
-        <w:rPr>
-          <w:rStyle w:val="FunctionTok"/>
-        </w:rPr>
-        <w:t xml:space="preserve">aes</w:t>
-      </w:r>
-      <w:r>
-        <w:rPr>
-          <w:rStyle w:val="NormalTok"/>
-        </w:rPr>
-        <w:t xml:space="preserve">(</w:t>
-      </w:r>
-      <w:r>
-        <w:rPr>
-          <w:rStyle w:val="AttributeTok"/>
-        </w:rPr>
-        <w:t xml:space="preserve">x =</w:t>
-      </w:r>
-      <w:r>
-        <w:rPr>
-          <w:rStyle w:val="NormalTok"/>
-        </w:rPr>
-        <w:t xml:space="preserve"> n, </w:t>
-      </w:r>
-      <w:r>
-        <w:rPr>
-          <w:rStyle w:val="AttributeTok"/>
-        </w:rPr>
-        <w:t xml:space="preserve">y =</w:t>
-      </w:r>
-      <w:r>
-        <w:rPr>
-          <w:rStyle w:val="NormalTok"/>
-        </w:rPr>
-        <w:t xml:space="preserve"> word)) </w:t>
-      </w:r>
-      <w:r>
-        <w:rPr>
-          <w:rStyle w:val="SpecialCharTok"/>
-        </w:rPr>
-        <w:t xml:space="preserve">+</w:t>
-      </w:r>
-      <w:r>
-        <w:br/>
-      </w:r>
-      <w:r>
-        <w:rPr>
-          <w:rStyle w:val="NormalTok"/>
-        </w:rPr>
-        <w:t xml:space="preserve">  </w:t>
-      </w:r>
-      <w:r>
-        <w:rPr>
-          <w:rStyle w:val="FunctionTok"/>
-        </w:rPr>
-        <w:t xml:space="preserve">geom_col</w:t>
-      </w:r>
-      <w:r>
-        <w:rPr>
-          <w:rStyle w:val="NormalTok"/>
-        </w:rPr>
-        <w:t xml:space="preserve">() </w:t>
-      </w:r>
-      <w:r>
-        <w:rPr>
-          <w:rStyle w:val="SpecialCharTok"/>
-        </w:rPr>
-        <w:t xml:space="preserve">+</w:t>
-      </w:r>
-      <w:r>
-        <w:br/>
-      </w:r>
-      <w:r>
-        <w:rPr>
-          <w:rStyle w:val="NormalTok"/>
-        </w:rPr>
-        <w:t xml:space="preserve">  </w:t>
-      </w:r>
-      <w:r>
-        <w:rPr>
-          <w:rStyle w:val="FunctionTok"/>
-        </w:rPr>
-        <w:t xml:space="preserve">labs</w:t>
-      </w:r>
-      <w:r>
-        <w:rPr>
-          <w:rStyle w:val="NormalTok"/>
-        </w:rPr>
-        <w:t xml:space="preserve">(</w:t>
-      </w:r>
-      <w:r>
-        <w:rPr>
-          <w:rStyle w:val="AttributeTok"/>
-        </w:rPr>
-        <w:t xml:space="preserve">title =</w:t>
-      </w:r>
-      <w:r>
-        <w:rPr>
-          <w:rStyle w:val="NormalTok"/>
-        </w:rPr>
-        <w:t xml:space="preserve"> </w:t>
-      </w:r>
-      <w:r>
-        <w:rPr>
-          <w:rStyle w:val="StringTok"/>
-        </w:rPr>
-        <w:t xml:space="preserve">"Most Commonly Used Words for 5-Star Reviews"</w:t>
-      </w:r>
-      <w:r>
-        <w:rPr>
-          <w:rStyle w:val="NormalTok"/>
-        </w:rPr>
-        <w:t xml:space="preserve">)</w:t>
-      </w:r>
-    </w:p>
-    <w:p>
-      <w:pPr>
-        <w:pStyle w:val="SourceCode"/>
-      </w:pPr>
-      <w:r>
-        <w:rPr>
-          <w:rStyle w:val="VerbatimChar"/>
-        </w:rPr>
-        <w:t xml:space="preserve">Joining with `by = join_by(word)`</w:t>
+        <w:rPr>
+          <w:rStyle w:val="NormalTok"/>
+        </w:rPr>
+        <w:t xml:space="preserve">  )</w:t>
       </w:r>
     </w:p>
     <w:p>
@@ -1352,20 +1112,20 @@
       <w:r>
         <w:drawing>
           <wp:inline>
-            <wp:extent cx="4620126" cy="3696101"/>
+            <wp:extent cx="5334000" cy="3111500"/>
             <wp:effectExtent b="0" l="0" r="0" t="0"/>
-            <wp:docPr descr="" title="" id="21" name="Picture"/>
+            <wp:docPr descr="" title="" id="13" name="Picture"/>
             <a:graphic>
               <a:graphicData uri="http://schemas.openxmlformats.org/drawingml/2006/picture">
                 <pic:pic>
                   <pic:nvPicPr>
-                    <pic:cNvPr descr="Exercise-03-Solution_files/figure-docx/unnamed-chunk-3-1.png" id="22" name="Picture"/>
+                    <pic:cNvPr descr="Exercise-03-Solution_files/figure-docx/unnamed-chunk-3-1.png" id="14" name="Picture"/>
                     <pic:cNvPicPr>
                       <a:picLocks noChangeArrowheads="1" noChangeAspect="1"/>
                     </pic:cNvPicPr>
                   </pic:nvPicPr>
                   <pic:blipFill>
-                    <a:blip r:embed="rId20"/>
+                    <a:blip r:embed="rId12"/>
                     <a:stretch>
                       <a:fillRect/>
                     </a:stretch>
@@ -1373,7 +1133,7 @@
                   <pic:spPr bwMode="auto">
                     <a:xfrm>
                       <a:off x="0" y="0"/>
-                      <a:ext cx="4620126" cy="3696101"/>
+                      <a:ext cx="5334000" cy="3111500"/>
                     </a:xfrm>
                     <a:prstGeom prst="rect">
                       <a:avLst/>
@@ -1392,11 +1152,47 @@
         </w:drawing>
       </w:r>
     </w:p>
-    <w:bookmarkEnd w:id="23"/>
+    <w:bookmarkEnd w:id="15"/>
+    <w:bookmarkStart w:id="16" w:name="interpretation"/>
+    <w:p>
+      <w:pPr>
+        <w:pStyle w:val="Heading3"/>
+      </w:pPr>
+      <w:r>
+        <w:t xml:space="preserve">Interpretation</w:t>
+      </w:r>
+    </w:p>
+    <w:p>
+      <w:pPr>
+        <w:pStyle w:val="FirstParagraph"/>
+      </w:pPr>
+      <w:r>
+        <w:t xml:space="preserve">The height of each full bar is 1, representing all customers in that region. Each colored segment shows the share with that college-degree status, not the number of customers. The count table retains the group sizes needed to interpret those shares.</w:t>
+      </w:r>
+    </w:p>
+    <w:p>
+      <w:pPr>
+        <w:pStyle w:val="BodyText"/>
+      </w:pPr>
+      <w:r>
+        <w:t xml:space="preserve">About 20% of customers in the South have college degrees, compared with roughly 79-81% in the other regions. Patagonia could investigate whether messages developed for its overall customer base also resonate with Southern customers, whose education profile differs substantially in these records.</w:t>
+      </w:r>
+    </w:p>
+    <w:p>
+      <w:pPr>
+        <w:pStyle w:val="BodyText"/>
+      </w:pPr>
+      <w:r>
+        <w:t xml:space="preserve">These differences do not establish that degree status causes different product preferences or that any particular message will work. The CRM records may also differ from the broader population of prospective customers. Testing messages and collecting preference data would be needed before choosing a regional campaign.</w:t>
+      </w:r>
+    </w:p>
+    <w:bookmarkEnd w:id="16"/>
+    <w:bookmarkEnd w:id="17"/>
     <w:sectPr>
       <w:footnotePr>
         <w:numRestart w:val="eachSect"/>
       </w:footnotePr>
+      <w:pgSz w:w="12240" w:h="15840"/>
     </w:sectPr>
   </w:body>
 </w:document>
@@ -1629,10 +1425,10 @@
   <w:docDefaults>
     <w:rPrDefault>
       <w:rPr>
-        <w:rFonts w:asciiTheme="minorHAnsi" w:cstheme="minorBidi" w:eastAsiaTheme="minorHAnsi" w:hAnsiTheme="minorHAnsi"/>
+        <w:rFonts w:asciiTheme="minorHAnsi" w:cstheme="minorBidi" w:eastAsiaTheme="minorEastAsia" w:hAnsiTheme="minorHAnsi"/>
         <w:sz w:val="24"/>
         <w:szCs w:val="24"/>
-        <w:lang w:bidi="ar-SA" w:eastAsia="en-US" w:val="en-US"/>
+        <w:lang w:bidi="ar-SA" w:eastAsia="zh-CN" w:val="en-US"/>
       </w:rPr>
     </w:rPrDefault>
     <w:pPrDefault>
@@ -1684,6 +1480,7 @@
     </w:pPr>
     <w:rPr>
       <w:rFonts w:asciiTheme="majorHAnsi" w:cstheme="majorBidi" w:eastAsiaTheme="majorEastAsia" w:hAnsiTheme="majorHAnsi"/>
+      <w:color w:val="000000"/>
       <w:sz w:val="56"/>
       <w:szCs w:val="56"/>
     </w:rPr>
@@ -1715,6 +1512,7 @@
     </w:pPr>
     <w:rPr>
       <w:rFonts w:cstheme="majorBidi" w:eastAsiaTheme="majorEastAsia"/>
+      <w:color w:val="000000"/>
       <w:spacing w:val="15"/>
       <w:sz w:val="28"/>
       <w:szCs w:val="28"/>
@@ -1818,7 +1616,7 @@
     </w:pPr>
     <w:rPr>
       <w:rFonts w:asciiTheme="majorHAnsi" w:cstheme="majorBidi" w:eastAsiaTheme="majorEastAsia" w:hAnsiTheme="majorHAnsi"/>
-      <w:color w:themeColor="accent1" w:themeShade="BF" w:val="0F4761"/>
+      <w:color w:val="000000"/>
       <w:sz w:val="40"/>
       <w:szCs w:val="40"/>
     </w:rPr>
@@ -1841,7 +1639,7 @@
     </w:pPr>
     <w:rPr>
       <w:rFonts w:asciiTheme="majorHAnsi" w:cstheme="majorBidi" w:eastAsiaTheme="majorEastAsia" w:hAnsiTheme="majorHAnsi"/>
-      <w:color w:themeColor="accent1" w:themeShade="BF" w:val="0F4761"/>
+      <w:color w:val="000000"/>
       <w:sz w:val="32"/>
       <w:szCs w:val="32"/>
     </w:rPr>
@@ -1864,7 +1662,7 @@
     </w:pPr>
     <w:rPr>
       <w:rFonts w:cstheme="majorBidi" w:eastAsiaTheme="majorEastAsia"/>
-      <w:color w:themeColor="accent1" w:themeShade="BF" w:val="0F4761"/>
+      <w:color w:val="000000"/>
       <w:sz w:val="28"/>
       <w:szCs w:val="28"/>
     </w:rPr>
@@ -1889,7 +1687,7 @@
       <w:rFonts w:cstheme="majorBidi" w:eastAsiaTheme="majorEastAsia"/>
       <w:i/>
       <w:iCs/>
-      <w:color w:themeColor="accent1" w:themeShade="BF" w:val="0F4761"/>
+      <w:color w:val="000000"/>
     </w:rPr>
   </w:style>
   <w:style w:styleId="Heading5" w:type="paragraph">
@@ -1910,7 +1708,7 @@
     </w:pPr>
     <w:rPr>
       <w:rFonts w:cstheme="majorBidi" w:eastAsiaTheme="majorEastAsia"/>
-      <w:color w:themeColor="accent1" w:themeShade="BF" w:val="0F4761"/>
+      <w:color w:val="000000"/>
     </w:rPr>
   </w:style>
   <w:style w:styleId="Heading6" w:type="paragraph">
@@ -1933,7 +1731,7 @@
       <w:rFonts w:cstheme="majorBidi" w:eastAsiaTheme="majorEastAsia"/>
       <w:i/>
       <w:iCs/>
-      <w:color w:themeColor="text1" w:themeTint="A6" w:val="595959"/>
+      <w:color w:val="000000"/>
     </w:rPr>
   </w:style>
   <w:style w:styleId="Heading7" w:type="paragraph">
@@ -1954,7 +1752,7 @@
     </w:pPr>
     <w:rPr>
       <w:rFonts w:cstheme="majorBidi" w:eastAsiaTheme="majorEastAsia"/>
-      <w:color w:themeColor="text1" w:themeTint="A6" w:val="595959"/>
+      <w:color w:val="000000"/>
     </w:rPr>
   </w:style>
   <w:style w:styleId="Heading8" w:type="paragraph">
@@ -1977,7 +1775,7 @@
       <w:rFonts w:cstheme="majorBidi" w:eastAsiaTheme="majorEastAsia"/>
       <w:i/>
       <w:iCs/>
-      <w:color w:themeColor="text1" w:themeTint="D8" w:val="272727"/>
+      <w:color w:val="000000"/>
     </w:rPr>
   </w:style>
   <w:style w:styleId="Heading9" w:type="paragraph">
@@ -1998,7 +1796,7 @@
     </w:pPr>
     <w:rPr>
       <w:rFonts w:cstheme="majorBidi" w:eastAsiaTheme="majorEastAsia"/>
-      <w:color w:themeColor="text1" w:themeTint="D8" w:val="272727"/>
+      <w:color w:val="000000"/>
     </w:rPr>
   </w:style>
   <w:style w:customStyle="1" w:styleId="Heading1Char" w:type="character">
@@ -2009,7 +1807,7 @@
     <w:rsid w:val="00A10FD9"/>
     <w:rPr>
       <w:rFonts w:asciiTheme="majorHAnsi" w:cstheme="majorBidi" w:eastAsiaTheme="majorEastAsia" w:hAnsiTheme="majorHAnsi"/>
-      <w:color w:themeColor="accent1" w:themeShade="BF" w:val="0F4761"/>
+      <w:color w:val="000000"/>
       <w:sz w:val="40"/>
       <w:szCs w:val="40"/>
     </w:rPr>
@@ -2023,7 +1821,7 @@
     <w:rsid w:val="00A10FD9"/>
     <w:rPr>
       <w:rFonts w:asciiTheme="majorHAnsi" w:cstheme="majorBidi" w:eastAsiaTheme="majorEastAsia" w:hAnsiTheme="majorHAnsi"/>
-      <w:color w:themeColor="accent1" w:themeShade="BF" w:val="0F4761"/>
+      <w:color w:val="000000"/>
       <w:sz w:val="32"/>
       <w:szCs w:val="32"/>
     </w:rPr>
@@ -2037,7 +1835,7 @@
     <w:rsid w:val="00A10FD9"/>
     <w:rPr>
       <w:rFonts w:cstheme="majorBidi" w:eastAsiaTheme="majorEastAsia"/>
-      <w:color w:themeColor="accent1" w:themeShade="BF" w:val="0F4761"/>
+      <w:color w:val="000000"/>
       <w:sz w:val="28"/>
       <w:szCs w:val="28"/>
     </w:rPr>
@@ -2053,7 +1851,7 @@
       <w:rFonts w:cstheme="majorBidi" w:eastAsiaTheme="majorEastAsia"/>
       <w:i/>
       <w:iCs/>
-      <w:color w:themeColor="accent1" w:themeShade="BF" w:val="0F4761"/>
+      <w:color w:val="000000"/>
     </w:rPr>
   </w:style>
   <w:style w:customStyle="1" w:styleId="Heading5Char" w:type="character">
@@ -2065,7 +1863,7 @@
     <w:rsid w:val="00A10FD9"/>
     <w:rPr>
       <w:rFonts w:cstheme="majorBidi" w:eastAsiaTheme="majorEastAsia"/>
-      <w:color w:themeColor="accent1" w:themeShade="BF" w:val="0F4761"/>
+      <w:color w:val="000000"/>
     </w:rPr>
   </w:style>
   <w:style w:customStyle="1" w:styleId="Heading6Char" w:type="character">
@@ -2079,7 +1877,7 @@
       <w:rFonts w:cstheme="majorBidi" w:eastAsiaTheme="majorEastAsia"/>
       <w:i/>
       <w:iCs/>
-      <w:color w:themeColor="text1" w:themeTint="A6" w:val="595959"/>
+      <w:color w:val="000000"/>
     </w:rPr>
   </w:style>
   <w:style w:customStyle="1" w:styleId="Heading7Char" w:type="character">
@@ -2091,7 +1889,7 @@
     <w:rsid w:val="00A10FD9"/>
     <w:rPr>
       <w:rFonts w:cstheme="majorBidi" w:eastAsiaTheme="majorEastAsia"/>
-      <w:color w:themeColor="text1" w:themeTint="A6" w:val="595959"/>
+      <w:color w:val="000000"/>
     </w:rPr>
   </w:style>
   <w:style w:customStyle="1" w:styleId="Heading8Char" w:type="character">
@@ -2105,7 +1903,7 @@
       <w:rFonts w:cstheme="majorBidi" w:eastAsiaTheme="majorEastAsia"/>
       <w:i/>
       <w:iCs/>
-      <w:color w:themeColor="text1" w:themeTint="D8" w:val="272727"/>
+      <w:color w:val="000000"/>
     </w:rPr>
   </w:style>
   <w:style w:customStyle="1" w:styleId="Heading9Char" w:type="character">
@@ -2117,7 +1915,7 @@
     <w:rsid w:val="00A10FD9"/>
     <w:rPr>
       <w:rFonts w:cstheme="majorBidi" w:eastAsiaTheme="majorEastAsia"/>
-      <w:color w:themeColor="text1" w:themeTint="D8" w:val="272727"/>
+      <w:color w:val="000000"/>
     </w:rPr>
   </w:style>
   <w:style w:styleId="BlockText" w:type="paragraph">
@@ -2173,13 +1971,6 @@
       </w:tblCellMar>
     </w:tblPr>
     <w:tblStylePr w:type="firstRow">
-      <w:tblPr>
-        <w:jc w:val="left"/>
-        <w:tblInd w:type="dxa" w:w="0"/>
-      </w:tblPr>
-      <w:trPr>
-        <w:jc w:val="left"/>
-      </w:trPr>
       <w:tcPr>
         <w:tcBorders>
           <w:bottom w:val="single"/>

</xml_diff>